<commit_message>
Edição dinâmica de relatórios, inclusão de solicitante na OS e correções no Modulo do Itinerário
</commit_message>
<xml_diff>
--- a/dados/modelo_os_eventos_it.docx
+++ b/dados/modelo_os_eventos_it.docx
@@ -1163,17 +1163,24 @@
                 <w:sz w:val="24"/>
                 <w:szCs w:val="24"/>
               </w:rPr>
-              <w:t>Em razão da realização do evento {{</w:t>
-            </w:r>
-            <w:r>
-              <w:rPr>
-                <w:sz w:val="24"/>
-                <w:szCs w:val="24"/>
-              </w:rPr>
-              <w:t xml:space="preserve">EVENTO}}, que acontecerá </w:t>
+              <w:t xml:space="preserve">Em </w:t>
+            </w:r>
+            <w:r>
+              <w:rPr>
+                <w:sz w:val="24"/>
+                <w:szCs w:val="24"/>
+              </w:rPr>
+              <w:t xml:space="preserve">razão da realização do evento {{EVENTO}}, </w:t>
             </w:r>
             <w:bookmarkStart w:id="0" w:name="_GoBack"/>
             <w:bookmarkEnd w:id="0"/>
+            <w:r>
+              <w:rPr>
+                <w:sz w:val="24"/>
+                <w:szCs w:val="24"/>
+              </w:rPr>
+              <w:t xml:space="preserve">que acontecerá </w:t>
+            </w:r>
             <w:r>
               <w:rPr>
                 <w:sz w:val="24"/>

</xml_diff>